<commit_message>
Verify agent behaviors and update evaluation evidence
</commit_message>
<xml_diff>
--- a/docs/BCT_Solution_Paper_Team_Ace.docx
+++ b/docs/BCT_Solution_Paper_Team_Ace.docx
@@ -602,7 +602,7 @@
               <w:rPr>
                 <w:color w:val="000000"/>
               </w:rPr>
-              <w:t>0.7357</w:t>
+              <w:t>0.7421</w:t>
             </w:r>
           </w:p>
         </w:tc>
@@ -687,7 +687,7 @@
               <w:rPr>
                 <w:color w:val="000000"/>
               </w:rPr>
-              <w:t>0.0481</w:t>
+              <w:t>0.1039</w:t>
             </w:r>
           </w:p>
         </w:tc>
@@ -727,7 +727,7 @@
               <w:rPr>
                 <w:color w:val="000000"/>
               </w:rPr>
-              <w:t>About 2.5x the popularity baseline</w:t>
+              <w:t>Reasoning-assisted ranking beats popularity baseline</w:t>
             </w:r>
           </w:p>
         </w:tc>
@@ -3631,7 +3631,7 @@
               <w:rPr>
                 <w:color w:val="000000"/>
               </w:rPr>
-              <w:t>0.7357</w:t>
+              <w:t>0.7421</w:t>
             </w:r>
           </w:p>
         </w:tc>
@@ -3671,7 +3671,7 @@
               <w:rPr>
                 <w:color w:val="000000"/>
               </w:rPr>
-              <w:t>0.5776</w:t>
+              <w:t>0.5712</w:t>
             </w:r>
           </w:p>
         </w:tc>
@@ -3716,7 +3716,7 @@
               <w:rPr>
                 <w:color w:val="000000"/>
               </w:rPr>
-              <w:t>0.0481</w:t>
+              <w:t>0.1039</w:t>
             </w:r>
           </w:p>
         </w:tc>
@@ -3756,7 +3756,7 @@
               <w:rPr>
                 <w:color w:val="000000"/>
               </w:rPr>
-              <w:t>0.0287</w:t>
+              <w:t>0.0845</w:t>
             </w:r>
           </w:p>
         </w:tc>
@@ -3801,7 +3801,7 @@
               <w:rPr>
                 <w:color w:val="000000"/>
               </w:rPr>
-              <w:t>0.1163</w:t>
+              <w:t>0.186</w:t>
             </w:r>
           </w:p>
         </w:tc>

</xml_diff>